<commit_message>
Phase 0: docextract-core, frozen contracts, text-model spec, sidecars, eval harness
- docextract-core: content hash, strict dataclass codec with schema_version,
  archives, LLM protocol, provisional Collection[T], form-extract contract test
- wordextract: model contracts, versions/hashed-input key computation
- docs: text-model spec (union stream, views, gap-closing), Phase 0 build spec
- fixtures: generator sidecars (pinned comment dates), spec-derived
  commentsExtended fixture, underwriting sample
- evals: L1/L2/L3 harness skeleton emitting an empty metrics table

Co-Authored-By: Claude Sonnet 5.5 <noreply@anthropic.com>
</commit_message>
<xml_diff>
--- a/fixtures/edge_cases.docx
+++ b/fixtures/edge_cases.docx
@@ -131,7 +131,7 @@
 
 <file path=word/comments.xml><?xml version="1.0" encoding="utf-8"?>
 <w:comments xmlns:a="http://schemas.openxmlformats.org/drawingml/2006/main" xmlns:pic="http://schemas.openxmlformats.org/drawingml/2006/picture" xmlns:r="http://schemas.openxmlformats.org/officeDocument/2006/relationships" xmlns:w="http://schemas.openxmlformats.org/wordprocessingml/2006/main" xmlns:wp="http://schemas.openxmlformats.org/drawingml/2006/wordprocessingDrawing" xmlns:mc="http://schemas.openxmlformats.org/markup-compatibility/2006" xmlns:a14="http://schemas.microsoft.com/office/drawing/2010/main" xmlns:w14="http://schemas.microsoft.com/office/word/2010/wordml" xmlns:wpc="http://schemas.microsoft.com/office/word/2010/wordprocessingCanvas">
-  <w:comment w:id="0" w:author="A" w:initials="A" w:date="2026-09-29T21:46:14Z">
+  <w:comment w:id="0" w:author="A" w:initials="A" w:date="2026-01-01T00:00:00Z">
     <w:p>
       <w:pPr>
         <w:pStyle w:val="CommentText"/>
@@ -147,7 +147,7 @@
       </w:r>
     </w:p>
   </w:comment>
-  <w:comment w:id="1" w:author="B" w:initials="B" w:date="2026-09-29T21:46:14Z">
+  <w:comment w:id="1" w:author="B" w:initials="B" w:date="2026-01-01T00:00:00Z">
     <w:p>
       <w:pPr>
         <w:pStyle w:val="CommentText"/>

</xml_diff>